<commit_message>
Updates to the technical details document
</commit_message>
<xml_diff>
--- a/biochar_app/markdown/docx/techDetails_updated.docx
+++ b/biochar_app/markdown/docx/techDetails_updated.docx
@@ -89,7 +89,13 @@
       </w:r>
       <w:proofErr w:type="gramEnd"/>
       <w:r>
-        <w:t xml:space="preserve"> IPv6 address to the base data station, a CR680 data logger configured as a rou</w:t>
+        <w:t xml:space="preserve"> IPv6 address to the base data station, a CR80</w:t>
+      </w:r>
+      <w:r>
+        <w:t>0</w:t>
+      </w:r>
+      <w:r>
+        <w:t xml:space="preserve"> data logger configured as a rou</w:t>
       </w:r>
       <w:r>
         <w:t>t</w:t>
@@ -114,7 +120,13 @@
     </w:p>
     <w:p>
       <w:r>
-        <w:t xml:space="preserve">The CS650 is configured as a water content reflectometer, with the two parallel rods forming an open-ended transmission line. A differential oscillator circuit is connected to the rods, with an oscillator state change triggered by the return of a reflected signal from one of the rods. The two-way travel time of the electromagnetic waves that are induced by the oscillator on the rod varies with changing dielectric permittivity. Water is the main contributor to the bulk dielectric permittivity of the soil or porous media, so the travel time of the reflected wave increases with increasing water content and decreases with decreasing water content, hence the name water content reflectometer. The average travel time of the reflected wave multiplied by a scaling factor of 128 is called the period average. Period average is reported in microseconds and </w:t>
+        <w:t>The CS650</w:t>
+      </w:r>
+      <w:r>
+        <w:t>s are</w:t>
+      </w:r>
+      <w:r>
+        <w:t xml:space="preserve"> configured as a water content reflectometer, with the two parallel rods forming an open-ended transmission line. A differential oscillator circuit is connected to the rods, with an oscillator state change triggered by the return of a reflected signal from one of the rods. The two-way travel time of the electromagnetic waves that are induced by the oscillator on the rod varies with changing dielectric permittivity. Water is the main contributor to the bulk dielectric permittivity of the soil or porous media, so the travel time of the reflected wave increases with increasing water content and decreases with decreasing water content, hence the name water content reflectometer. The average travel time of the reflected wave multiplied by a scaling factor of 128 is called the period average. Period average is reported in microseconds and </w:t>
       </w:r>
       <w:r>
         <w:t>is</w:t>
@@ -184,7 +196,19 @@
         <w:t>ly</w:t>
       </w:r>
       <w:r>
-        <w:t xml:space="preserve"> and daily averages. When memory is full, the oldest data is removed and new data added. The data logger also has an RS-232 port that can be used to download data and upload programs.</w:t>
+        <w:t xml:space="preserve"> and daily averages. When memory is full, the oldest data </w:t>
+      </w:r>
+      <w:r>
+        <w:t>are</w:t>
+      </w:r>
+      <w:r>
+        <w:t xml:space="preserve"> removed and new data added. </w:t>
+      </w:r>
+      <w:r>
+        <w:t>Each</w:t>
+      </w:r>
+      <w:r>
+        <w:t xml:space="preserve"> data logger also has an RS-232 port that can be used to download data and upload programs.</w:t>
       </w:r>
     </w:p>
     <w:p>
@@ -265,7 +289,13 @@
       </w:r>
       <w:proofErr w:type="spellEnd"/>
       <w:r>
-        <w:t xml:space="preserve"> router. The Starlink IPv4 address can't use port forwarding so it is necessary to configure the ASUS router to accept and assign IPv6 addresses. The network device in the base station receives this address and provides access to the field dataloggers via the RF data transfer process.</w:t>
+        <w:t xml:space="preserve"> router. The Starlink IPv4 address </w:t>
+      </w:r>
+      <w:r>
+        <w:t>is blocked from</w:t>
+      </w:r>
+      <w:r>
+        <w:t xml:space="preserve"> port forwarding so it is necessary to configure the ASUS router to accept and assign IPv6 addresses. The network device in the base station receives this address and provides access to the field dataloggers via the RF data transfer process.</w:t>
       </w:r>
     </w:p>
     <w:p>

</xml_diff>